<commit_message>
Revert "Szilveszter 1. feltoltes"
</commit_message>
<xml_diff>
--- a/teszt.docx
+++ b/teszt.docx
@@ -1,6 +1,6 @@
 
 <file path=word/document.xml><?xml version="1.0" encoding="utf-8"?>
-<w:document xmlns:wpc="http://schemas.microsoft.com/office/word/2010/wordprocessingCanvas" xmlns:cx="http://schemas.microsoft.com/office/drawing/2014/chartex" xmlns:mc="http://schemas.openxmlformats.org/markup-compatibility/2006" xmlns:o="urn:schemas-microsoft-com:office:office" xmlns:r="http://schemas.openxmlformats.org/officeDocument/2006/relationships" xmlns:m="http://schemas.openxmlformats.org/officeDocument/2006/math" xmlns:v="urn:schemas-microsoft-com:vml" xmlns:wp14="http://schemas.microsoft.com/office/word/2010/wordprocessingDrawing" xmlns:wp="http://schemas.openxmlformats.org/drawingml/2006/wordprocessingDrawing" xmlns:w10="urn:schemas-microsoft-com:office:word" xmlns:w="http://schemas.openxmlformats.org/wordprocessingml/2006/main" xmlns:w14="http://schemas.microsoft.com/office/word/2010/wordml" xmlns:w15="http://schemas.microsoft.com/office/word/2012/wordml" xmlns:w16se="http://schemas.microsoft.com/office/word/2015/wordml/symex" xmlns:wpg="http://schemas.microsoft.com/office/word/2010/wordprocessingGroup" xmlns:wpi="http://schemas.microsoft.com/office/word/2010/wordprocessingInk" xmlns:wne="http://schemas.microsoft.com/office/word/2006/wordml" xmlns:wps="http://schemas.microsoft.com/office/word/2010/wordprocessingShape" mc:Ignorable="w14 w15 w16se wp14">
+<w:document xmlns:wpc="http://schemas.microsoft.com/office/word/2010/wordprocessingCanvas" xmlns:cx="http://schemas.microsoft.com/office/drawing/2014/chartex" xmlns:cx1="http://schemas.microsoft.com/office/drawing/2015/9/8/chartex" xmlns:mc="http://schemas.openxmlformats.org/markup-compatibility/2006" xmlns:o="urn:schemas-microsoft-com:office:office" xmlns:r="http://schemas.openxmlformats.org/officeDocument/2006/relationships" xmlns:m="http://schemas.openxmlformats.org/officeDocument/2006/math" xmlns:v="urn:schemas-microsoft-com:vml" xmlns:wp14="http://schemas.microsoft.com/office/word/2010/wordprocessingDrawing" xmlns:wp="http://schemas.openxmlformats.org/drawingml/2006/wordprocessingDrawing" xmlns:w10="urn:schemas-microsoft-com:office:word" xmlns:w="http://schemas.openxmlformats.org/wordprocessingml/2006/main" xmlns:w14="http://schemas.microsoft.com/office/word/2010/wordml" xmlns:w15="http://schemas.microsoft.com/office/word/2012/wordml" xmlns:w16se="http://schemas.microsoft.com/office/word/2015/wordml/symex" xmlns:wpg="http://schemas.microsoft.com/office/word/2010/wordprocessingGroup" xmlns:wpi="http://schemas.microsoft.com/office/word/2010/wordprocessingInk" xmlns:wne="http://schemas.microsoft.com/office/word/2006/wordml" xmlns:wps="http://schemas.microsoft.com/office/word/2010/wordprocessingShape" mc:Ignorable="w14 w15 w16se wp14">
   <w:body>
     <w:p>
       <w:pPr>
@@ -127,31 +127,22 @@
     </w:p>
     <w:p>
       <w:pPr>
-        <w:pStyle w:val="NormlWeb"/>
+        <w:rPr>
+          <w:rFonts w:ascii="Times New Roman" w:hAnsi="Times New Roman" w:cs="Times New Roman"/>
+          <w:color w:val="538135" w:themeColor="accent6" w:themeShade="BF"/>
+          <w:sz w:val="48"/>
+          <w:szCs w:val="48"/>
+        </w:rPr>
       </w:pPr>
       <w:r>
-        <w:t>Az iskola a tanulás helye, ahol új dolgokat ismerünk meg, és barátokat szerzünk. Segít felkészülni a jövőre.</w:t>
-      </w:r>
-      <w:bookmarkStart w:id="0" w:name="_GoBack"/>
-      <w:r>
-        <w:rPr>
+        <w:rPr>
+          <w:rFonts w:ascii="Times New Roman" w:hAnsi="Times New Roman" w:cs="Times New Roman"/>
           <w:color w:val="538135" w:themeColor="accent6" w:themeShade="BF"/>
           <w:sz w:val="48"/>
           <w:szCs w:val="48"/>
         </w:rPr>
         <w:br w:type="page"/>
       </w:r>
-      <w:bookmarkEnd w:id="0"/>
-    </w:p>
-    <w:p>
-      <w:pPr>
-        <w:rPr>
-          <w:rFonts w:ascii="Times New Roman" w:hAnsi="Times New Roman" w:cs="Times New Roman"/>
-          <w:color w:val="538135" w:themeColor="accent6" w:themeShade="BF"/>
-          <w:sz w:val="48"/>
-          <w:szCs w:val="48"/>
-        </w:rPr>
-      </w:pPr>
     </w:p>
     <w:p>
       <w:pPr>
@@ -170,6 +161,7 @@
           <w:sz w:val="48"/>
           <w:szCs w:val="48"/>
         </w:rPr>
+        <w:lastRenderedPageBreak/>
         <w:t>Zsolt</w:t>
       </w:r>
     </w:p>
@@ -181,6 +173,8 @@
           <w:szCs w:val="24"/>
         </w:rPr>
       </w:pPr>
+      <w:bookmarkStart w:id="0" w:name="_GoBack"/>
+      <w:bookmarkEnd w:id="0"/>
     </w:p>
     <w:sectPr>
       <w:pgSz w:w="11906" w:h="16838"/>
@@ -613,23 +607,6 @@
     <w:semiHidden/>
     <w:unhideWhenUsed/>
   </w:style>
-  <w:style w:type="paragraph" w:styleId="NormlWeb">
-    <w:name w:val="Normal (Web)"/>
-    <w:basedOn w:val="Norml"/>
-    <w:uiPriority w:val="99"/>
-    <w:semiHidden/>
-    <w:unhideWhenUsed/>
-    <w:rsid w:val="00073ED7"/>
-    <w:pPr>
-      <w:spacing w:before="100" w:beforeAutospacing="1" w:after="100" w:afterAutospacing="1" w:line="240" w:lineRule="auto"/>
-    </w:pPr>
-    <w:rPr>
-      <w:rFonts w:ascii="Times New Roman" w:eastAsia="Times New Roman" w:hAnsi="Times New Roman" w:cs="Times New Roman"/>
-      <w:sz w:val="24"/>
-      <w:szCs w:val="24"/>
-      <w:lang w:eastAsia="hu-HU"/>
-    </w:rPr>
-  </w:style>
 </w:styles>
 </file>
 

</xml_diff>